<commit_message>
manager auto-signature & real outlet data
</commit_message>
<xml_diff>
--- a/storage/templates/pr-template.docx
+++ b/storage/templates/pr-template.docx
@@ -1323,19 +1323,6 @@
                                   <w:pPr>
                                     <w:spacing w:after="80"/>
                                     <w:jc w:val="center"/>
-                                  </w:pPr>
-                                  <w:r>
-                                    <w:rPr>
-                                      <w:sz w:val="20"/>
-                                      <w:szCs w:val="20"/>
-                                    </w:rPr>
-                                    <w:t>${staff_name}</w:t>
-                                  </w:r>
-                                </w:p>
-                                <w:p>
-                                  <w:pPr>
-                                    <w:pStyle w:val="TableParagraph"/>
-                                    <w:jc w:val="center"/>
                                     <w:rPr>
                                       <w:rFonts w:ascii="Times New Roman"/>
                                       <w:sz w:val="18"/>
@@ -1360,18 +1347,6 @@
                                   <w:pPr>
                                     <w:spacing w:after="80"/>
                                     <w:jc w:val="center"/>
-                                  </w:pPr>
-                                  <w:r>
-                                    <w:rPr>
-                                      <w:sz w:val="20"/>
-                                      <w:szCs w:val="20"/>
-                                    </w:rPr>
-                                    <w:t>${manager_name}</w:t>
-                                  </w:r>
-                                </w:p>
-                                <w:p>
-                                  <w:pPr>
-                                    <w:pStyle w:val="TableParagraph"/>
                                     <w:rPr>
                                       <w:rFonts w:ascii="Times New Roman"/>
                                       <w:sz w:val="18"/>
@@ -1547,19 +1522,6 @@
                             <w:pPr>
                               <w:spacing w:after="80"/>
                               <w:jc w:val="center"/>
-                            </w:pPr>
-                            <w:r>
-                              <w:rPr>
-                                <w:sz w:val="20"/>
-                                <w:szCs w:val="20"/>
-                              </w:rPr>
-                              <w:t>${staff_name}</w:t>
-                            </w:r>
-                          </w:p>
-                          <w:p>
-                            <w:pPr>
-                              <w:pStyle w:val="TableParagraph"/>
-                              <w:jc w:val="center"/>
                               <w:rPr>
                                 <w:rFonts w:ascii="Times New Roman"/>
                                 <w:sz w:val="18"/>
@@ -1584,18 +1546,6 @@
                             <w:pPr>
                               <w:spacing w:after="80"/>
                               <w:jc w:val="center"/>
-                            </w:pPr>
-                            <w:r>
-                              <w:rPr>
-                                <w:sz w:val="20"/>
-                                <w:szCs w:val="20"/>
-                              </w:rPr>
-                              <w:t>${manager_name}</w:t>
-                            </w:r>
-                          </w:p>
-                          <w:p>
-                            <w:pPr>
-                              <w:pStyle w:val="TableParagraph"/>
                               <w:rPr>
                                 <w:rFonts w:ascii="Times New Roman"/>
                                 <w:sz w:val="18"/>

</xml_diff>